<commit_message>
Update Bible resource content and metadata for multiple languages for 2026-06-24 release
</commit_message>
<xml_diff>
--- a/eng/docx/004.content.docx
+++ b/eng/docx/004.content.docx
@@ -190,6 +190,173 @@
         <w:rPr>
           <w:lang w:val="en_US" w:bidi="en_US"/>
         </w:rPr>
+        <w:t>Dalmanutha</w:t>
+      </w:r>
+      <w:r>
+        <w:rPr>
+          <w:lang w:val="en_US" w:bidi="en_US"/>
+        </w:rPr>
+      </w:r>
+    </w:p>
+    <w:p>
+      <w:pPr/>
+      <w:r>
+        <w:rPr>
+          <w:lang w:val="en_US" w:bidi="en_US"/>
+        </w:rPr>
+      </w:r>
+      <w:r>
+        <w:rPr>
+          <w:b/>
+          <w:lang w:val="en_US" w:bidi="en_US"/>
+        </w:rPr>
+        <w:t>Dalmanutha</w:t>
+      </w:r>
+      <w:r>
+        <w:rPr>
+          <w:lang w:val="en_US" w:bidi="en_US"/>
+        </w:rPr>
+        <w:t xml:space="preserve"> is a village on the west coast of the </w:t>
+      </w:r>
+      <w:hyperlink r:id="rId13">
+        <w:r>
+          <w:rPr>
+            <w:lang w:val="en_US" w:bidi="en_US"/>
+          </w:rPr>
+          <w:rPr>
+            <w:color w:val="0000EE"/>
+            <w:u w:val="single"/>
+          </w:rPr>
+          <w:t>Sea of Galilee</w:t>
+        </w:r>
+      </w:hyperlink>
+      <w:r>
+        <w:rPr>
+          <w:lang w:val="en_US" w:bidi="en_US"/>
+        </w:rPr>
+        <w:t xml:space="preserve">. Mark says in Mark 8:10 that Jesus and his </w:t>
+      </w:r>
+      <w:hyperlink r:id="rId14">
+        <w:r>
+          <w:rPr>
+            <w:lang w:val="en_US" w:bidi="en_US"/>
+          </w:rPr>
+          <w:rPr>
+            <w:color w:val="0000EE"/>
+            <w:u w:val="single"/>
+          </w:rPr>
+          <w:t>disciples</w:t>
+        </w:r>
+      </w:hyperlink>
+      <w:r>
+        <w:rPr>
+          <w:lang w:val="en_US" w:bidi="en_US"/>
+        </w:rPr>
+        <w:t xml:space="preserve"> went to Dalmanutha after Jesus fed 4,000 people on the northeast side of the Sea of Galilee. Some people believe that this is the same village as Magdala or Magadan, because Matthew says in Matthew 15:39 that after Jesus fed 4,000 people, Jesus and his disciples went to Magadan.</w:t>
+      </w:r>
+      <w:r>
+        <w:rPr>
+          <w:lang w:val="en_US" w:bidi="en_US"/>
+        </w:rPr>
+      </w:r>
+      <w:r>
+        <w:rPr>
+          <w:lang w:val="en_US" w:bidi="en_US"/>
+        </w:rPr>
+      </w:r>
+    </w:p>
+    <w:p>
+      <w:pPr/>
+      <w:r>
+        <w:rPr>
+          <w:lang w:val="en_US" w:bidi="en_US"/>
+        </w:rPr>
+      </w:r>
+    </w:p>
+    <w:p>
+      <w:pPr>
+        <w:pStyle w:val="Heading2"/>
+      </w:pPr>
+      <w:r>
+        <w:rPr>
+          <w:lang w:val="en_US" w:bidi="en_US"/>
+        </w:rPr>
+        <w:t>Dalmanutha</w:t>
+      </w:r>
+      <w:r>
+        <w:rPr>
+          <w:lang w:val="en_US" w:bidi="en_US"/>
+        </w:rPr>
+      </w:r>
+    </w:p>
+    <w:p>
+      <w:pPr>
+        <w:pStyle w:val="Heading4"/>
+      </w:pPr>
+      <w:r>
+        <w:rPr>
+          <w:lang w:val="en_US" w:bidi="en_US"/>
+        </w:rPr>
+        <w:t>Audio Content</w:t>
+      </w:r>
+      <w:r>
+        <w:rPr>
+          <w:lang w:val="en_US" w:bidi="en_US"/>
+        </w:rPr>
+      </w:r>
+    </w:p>
+    <w:p>
+      <w:pPr/>
+      <w:r>
+        <w:rPr>
+          <w:lang w:val="en_US" w:bidi="en_US"/>
+        </w:rPr>
+      </w:r>
+      <w:hyperlink r:id="rId15">
+        <w:r>
+          <w:rPr>
+            <w:lang w:val="en_US" w:bidi="en_US"/>
+          </w:rPr>
+          <w:rPr>
+            <w:color w:val="0000EE"/>
+            <w:u w:val="single"/>
+          </w:rPr>
+          <w:t>mp3 file</w:t>
+        </w:r>
+      </w:hyperlink>
+      <w:r>
+        <w:rPr>
+          <w:lang w:val="en_US" w:bidi="en_US"/>
+        </w:rPr>
+        <w:t xml:space="preserve"> (369597 KB)</w:t>
+      </w:r>
+      <w:r>
+        <w:rPr>
+          <w:lang w:val="en_US" w:bidi="en_US"/>
+        </w:rPr>
+      </w:r>
+      <w:r>
+        <w:rPr>
+          <w:lang w:val="en_US" w:bidi="en_US"/>
+        </w:rPr>
+      </w:r>
+    </w:p>
+    <w:p>
+      <w:pPr/>
+      <w:r>
+        <w:rPr>
+          <w:lang w:val="en_US" w:bidi="en_US"/>
+        </w:rPr>
+      </w:r>
+    </w:p>
+    <w:p>
+      <w:pPr>
+        <w:pStyle w:val="Heading2"/>
+      </w:pPr>
+      <w:r>
+        <w:rPr>
+          <w:lang w:val="en_US" w:bidi="en_US"/>
+        </w:rPr>
         <w:t>David</w:t>
       </w:r>
       <w:r>
@@ -218,7 +385,7 @@
         </w:rPr>
         <w:t xml:space="preserve"> was the second </w:t>
       </w:r>
-      <w:hyperlink r:id="rId13">
+      <w:hyperlink r:id="rId16">
         <w:r>
           <w:rPr>
             <w:lang w:val="en_US" w:bidi="en_US"/>
@@ -236,7 +403,7 @@
         </w:rPr>
         <w:t xml:space="preserve"> of </w:t>
       </w:r>
-      <w:hyperlink r:id="rId14">
+      <w:hyperlink r:id="rId17">
         <w:r>
           <w:rPr>
             <w:lang w:val="en_US" w:bidi="en_US"/>
@@ -268,7 +435,7 @@
         </w:rPr>
         <w:t xml:space="preserve">David was the youngest son of a man named Jesse. David took care of his father's sheep. Jesse and his family lived in the village called </w:t>
       </w:r>
-      <w:hyperlink r:id="rId15">
+      <w:hyperlink r:id="rId18">
         <w:r>
           <w:rPr>
             <w:lang w:val="en_US" w:bidi="en_US"/>
@@ -286,7 +453,7 @@
         </w:rPr>
         <w:t xml:space="preserve">. David's older brothers were soldiers in the army of King Saul, the first king of Israel. King Saul had been disobedient to God, and so God had rejected him. Because of that, God instructed the </w:t>
       </w:r>
-      <w:hyperlink r:id="rId16">
+      <w:hyperlink r:id="rId19">
         <w:r>
           <w:rPr>
             <w:lang w:val="en_US" w:bidi="en_US"/>
@@ -304,7 +471,7 @@
         </w:rPr>
         <w:t xml:space="preserve"> Samuel to </w:t>
       </w:r>
-      <w:hyperlink r:id="rId17">
+      <w:hyperlink r:id="rId20">
         <w:r>
           <w:rPr>
             <w:lang w:val="en_US" w:bidi="en_US"/>
@@ -336,7 +503,7 @@
         </w:rPr>
         <w:t xml:space="preserve">One time, when King Saul and his army were fighting with some enemies, the </w:t>
       </w:r>
-      <w:hyperlink r:id="rId18">
+      <w:hyperlink r:id="rId21">
         <w:r>
           <w:rPr>
             <w:lang w:val="en_US" w:bidi="en_US"/>
@@ -354,7 +521,7 @@
         </w:rPr>
         <w:t xml:space="preserve"> lost a battle and King Saul and his sons were killed. After this, the people of Israel made David their king. David began to live in </w:t>
       </w:r>
-      <w:hyperlink r:id="rId19">
+      <w:hyperlink r:id="rId22">
         <w:r>
           <w:rPr>
             <w:lang w:val="en_US" w:bidi="en_US"/>
@@ -386,7 +553,7 @@
         </w:rPr>
         <w:t xml:space="preserve">David became Israel's most beloved king. He loved God and trusted him. Therefore God called him a "man after God's heart." David very much wanted to build a </w:t>
       </w:r>
-      <w:hyperlink r:id="rId20">
+      <w:hyperlink r:id="rId23">
         <w:r>
           <w:rPr>
             <w:lang w:val="en_US" w:bidi="en_US"/>
@@ -404,7 +571,7 @@
         </w:rPr>
         <w:t xml:space="preserve"> for God, but God told David that not David, but David's son, would build this temple. And God gave David a very important promise. God promised David that one of his </w:t>
       </w:r>
-      <w:hyperlink r:id="rId21">
+      <w:hyperlink r:id="rId24">
         <w:r>
           <w:rPr>
             <w:lang w:val="en_US" w:bidi="en_US"/>
@@ -436,7 +603,7 @@
         </w:rPr>
         <w:t xml:space="preserve">This does not mean that David never did anything wrong. In fact, he did some terrible things: He committed </w:t>
       </w:r>
-      <w:hyperlink r:id="rId22">
+      <w:hyperlink r:id="rId25">
         <w:r>
           <w:rPr>
             <w:lang w:val="en_US" w:bidi="en_US"/>
@@ -454,7 +621,7 @@
         </w:rPr>
         <w:t xml:space="preserve"> and murder. But he </w:t>
       </w:r>
-      <w:hyperlink r:id="rId23">
+      <w:hyperlink r:id="rId26">
         <w:r>
           <w:rPr>
             <w:lang w:val="en_US" w:bidi="en_US"/>
@@ -472,7 +639,7 @@
         </w:rPr>
         <w:t xml:space="preserve"> of his </w:t>
       </w:r>
-      <w:hyperlink r:id="rId24">
+      <w:hyperlink r:id="rId27">
         <w:r>
           <w:rPr>
             <w:lang w:val="en_US" w:bidi="en_US"/>
@@ -490,7 +657,7 @@
         </w:rPr>
         <w:t xml:space="preserve">, and God forgave him. But even though God </w:t>
       </w:r>
-      <w:hyperlink r:id="rId25">
+      <w:hyperlink r:id="rId28">
         <w:r>
           <w:rPr>
             <w:lang w:val="en_US" w:bidi="en_US"/>
@@ -536,7 +703,7 @@
         </w:rPr>
         <w:t xml:space="preserve">Hundreds of years after David's death, the </w:t>
       </w:r>
-      <w:hyperlink r:id="rId26">
+      <w:hyperlink r:id="rId29">
         <w:r>
           <w:rPr>
             <w:lang w:val="en_US" w:bidi="en_US"/>
@@ -612,7 +779,7 @@
           <w:lang w:val="en_US" w:bidi="en_US"/>
         </w:rPr>
       </w:r>
-      <w:hyperlink r:id="rId27">
+      <w:hyperlink r:id="rId30">
         <w:r>
           <w:rPr>
             <w:lang w:val="en_US" w:bidi="en_US"/>
@@ -685,7 +852,7 @@
         </w:rPr>
         <w:t xml:space="preserve"> literally means "10 cities." The word refers to an area east of the </w:t>
       </w:r>
-      <w:hyperlink r:id="rId28">
+      <w:hyperlink r:id="rId13">
         <w:r>
           <w:rPr>
             <w:lang w:val="en_US" w:bidi="en_US"/>
@@ -703,7 +870,7 @@
         </w:rPr>
         <w:t xml:space="preserve"> and the </w:t>
       </w:r>
-      <w:hyperlink r:id="rId29">
+      <w:hyperlink r:id="rId31">
         <w:r>
           <w:rPr>
             <w:lang w:val="en_US" w:bidi="en_US"/>
@@ -721,7 +888,7 @@
         </w:rPr>
         <w:t xml:space="preserve">. Most people that lived there were not </w:t>
       </w:r>
-      <w:hyperlink r:id="rId30">
+      <w:hyperlink r:id="rId32">
         <w:r>
           <w:rPr>
             <w:lang w:val="en_US" w:bidi="en_US"/>
@@ -797,7 +964,7 @@
           <w:lang w:val="en_US" w:bidi="en_US"/>
         </w:rPr>
       </w:r>
-      <w:hyperlink r:id="rId31">
+      <w:hyperlink r:id="rId33">
         <w:r>
           <w:rPr>
             <w:lang w:val="en_US" w:bidi="en_US"/>
@@ -876,7 +1043,7 @@
         </w:rPr>
         <w:t xml:space="preserve">, </w:t>
       </w:r>
-      <w:hyperlink r:id="rId32">
+      <w:hyperlink r:id="rId34">
         <w:r>
           <w:rPr>
             <w:lang w:val="en_US" w:bidi="en_US"/>
@@ -907,7 +1074,7 @@
         </w:rPr>
         <w:t xml:space="preserve"> all refer to the same thing. A demon is a spirit that is rebelling against God. The leader of all demons is called </w:t>
       </w:r>
-      <w:hyperlink r:id="rId33">
+      <w:hyperlink r:id="rId35">
         <w:r>
           <w:rPr>
             <w:lang w:val="en_US" w:bidi="en_US"/>
@@ -925,7 +1092,7 @@
         </w:rPr>
         <w:t xml:space="preserve">, the </w:t>
       </w:r>
-      <w:hyperlink r:id="rId34">
+      <w:hyperlink r:id="rId36">
         <w:r>
           <w:rPr>
             <w:lang w:val="en_US" w:bidi="en_US"/>
@@ -943,7 +1110,7 @@
         </w:rPr>
         <w:t xml:space="preserve">, or sometimes Beelzebul. Because God created everything that exists, God also created these spirits. God created them good, as </w:t>
       </w:r>
-      <w:hyperlink r:id="rId35">
+      <w:hyperlink r:id="rId37">
         <w:r>
           <w:rPr>
             <w:lang w:val="en_US" w:bidi="en_US"/>
@@ -961,7 +1128,7 @@
         </w:rPr>
         <w:t xml:space="preserve">, to do his work. But some </w:t>
       </w:r>
-      <w:hyperlink r:id="rId35">
+      <w:hyperlink r:id="rId37">
         <w:r>
           <w:rPr>
             <w:lang w:val="en_US" w:bidi="en_US"/>
@@ -993,7 +1160,7 @@
         </w:rPr>
         <w:t>Demons can take control of people so that people become sick or behave in a strange way. When a demon takes control of a person, we say that the person is "</w:t>
       </w:r>
-      <w:hyperlink r:id="rId36">
+      <w:hyperlink r:id="rId38">
         <w:r>
           <w:rPr>
             <w:lang w:val="en_US" w:bidi="en_US"/>
@@ -1011,7 +1178,7 @@
         </w:rPr>
         <w:t xml:space="preserve">." A person who was possessed by a demon could become deaf, mute, or have fits that resemble epileptic attacks. The person could become very violent and shout. </w:t>
       </w:r>
-      <w:hyperlink r:id="rId30">
+      <w:hyperlink r:id="rId32">
         <w:r>
           <w:rPr>
             <w:lang w:val="en_US" w:bidi="en_US"/>
@@ -1043,7 +1210,7 @@
         </w:rPr>
         <w:t xml:space="preserve">Demons can also be called evil spirits. This makes clear that their intentions are </w:t>
       </w:r>
-      <w:hyperlink r:id="rId37">
+      <w:hyperlink r:id="rId39">
         <w:r>
           <w:rPr>
             <w:lang w:val="en_US" w:bidi="en_US"/>
@@ -1061,7 +1228,7 @@
         </w:rPr>
         <w:t xml:space="preserve">. They sometimes are called unclean spirits. Something that is </w:t>
       </w:r>
-      <w:hyperlink r:id="rId38">
+      <w:hyperlink r:id="rId40">
         <w:r>
           <w:rPr>
             <w:lang w:val="en_US" w:bidi="en_US"/>
@@ -1166,7 +1333,7 @@
           <w:lang w:val="en_US" w:bidi="en_US"/>
         </w:rPr>
       </w:r>
-      <w:hyperlink r:id="rId39">
+      <w:hyperlink r:id="rId41">
         <w:r>
           <w:rPr>
             <w:lang w:val="en_US" w:bidi="en_US"/>
@@ -1303,7 +1470,7 @@
           <w:lang w:val="en_US" w:bidi="en_US"/>
         </w:rPr>
       </w:r>
-      <w:hyperlink r:id="rId40">
+      <w:hyperlink r:id="rId42">
         <w:r>
           <w:rPr>
             <w:lang w:val="en_US" w:bidi="en_US"/>
@@ -1382,7 +1549,7 @@
         </w:rPr>
         <w:t xml:space="preserve"> are his children, grandchildren, and all future generations from the same family line. The </w:t>
       </w:r>
-      <w:hyperlink r:id="rId18">
+      <w:hyperlink r:id="rId21">
         <w:r>
           <w:rPr>
             <w:lang w:val="en_US" w:bidi="en_US"/>
@@ -1400,7 +1567,7 @@
         </w:rPr>
         <w:t xml:space="preserve"> are descendants of Jacob, </w:t>
       </w:r>
-      <w:hyperlink r:id="rId41">
+      <w:hyperlink r:id="rId43">
         <w:r>
           <w:rPr>
             <w:lang w:val="en_US" w:bidi="en_US"/>
@@ -1409,14 +1576,78 @@
             <w:color w:val="0000EE"/>
             <w:u w:val="single"/>
           </w:rPr>
-          <w:t>Abraham's</w:t>
+          <w:t>Abraham</w:t>
         </w:r>
       </w:hyperlink>
       <w:r>
         <w:rPr>
           <w:lang w:val="en_US" w:bidi="en_US"/>
         </w:rPr>
-        <w:t xml:space="preserve"> grandson. Jacob is the ancestor of the Israelites.</w:t>
+        <w:t>'s grandson. Jacob is the ancestor of the Israelites.</w:t>
+      </w:r>
+    </w:p>
+    <w:p>
+      <w:pPr/>
+      <w:r>
+        <w:rPr>
+          <w:lang w:val="en_US" w:bidi="en_US"/>
+        </w:rPr>
+      </w:r>
+      <w:r>
+        <w:rPr>
+          <w:lang w:val="en_US" w:bidi="en_US"/>
+        </w:rPr>
+        <w:t xml:space="preserve">Sometimes, storytellers will use the words for "son" or a person's male child to talk about a descendant. For example, people sometimes refer to King </w:t>
+      </w:r>
+      <w:hyperlink r:id="rId44">
+        <w:r>
+          <w:rPr>
+            <w:lang w:val="en_US" w:bidi="en_US"/>
+          </w:rPr>
+          <w:rPr>
+            <w:color w:val="0000EE"/>
+            <w:u w:val="single"/>
+          </w:rPr>
+          <w:t>David</w:t>
+        </w:r>
+      </w:hyperlink>
+      <w:r>
+        <w:rPr>
+          <w:lang w:val="en_US" w:bidi="en_US"/>
+        </w:rPr>
+        <w:t>'s descendants as "the sons of David" even if those people are David's grandchildren or later descendants. People called Jesus "the Son of David" even though there were many generations between Jesus and his ancestor David!</w:t>
+      </w:r>
+    </w:p>
+    <w:p>
+      <w:pPr/>
+      <w:r>
+        <w:rPr>
+          <w:lang w:val="en_US" w:bidi="en_US"/>
+        </w:rPr>
+      </w:r>
+      <w:r>
+        <w:rPr>
+          <w:lang w:val="en_US" w:bidi="en_US"/>
+        </w:rPr>
+        <w:t xml:space="preserve">If you have a passage where the storyteller uses the word "son" to mean "descendant," you can also refer to the information in the Master Glossary about the word </w:t>
+      </w:r>
+      <w:hyperlink r:id="rId45">
+        <w:r>
+          <w:rPr>
+            <w:lang w:val="en_US" w:bidi="en_US"/>
+          </w:rPr>
+          <w:rPr>
+            <w:color w:val="0000EE"/>
+            <w:u w:val="single"/>
+          </w:rPr>
+          <w:t>son</w:t>
+        </w:r>
+      </w:hyperlink>
+      <w:r>
+        <w:rPr>
+          <w:lang w:val="en_US" w:bidi="en_US"/>
+        </w:rPr>
+        <w:t>.</w:t>
       </w:r>
       <w:r>
         <w:rPr>
@@ -1476,7 +1707,7 @@
           <w:lang w:val="en_US" w:bidi="en_US"/>
         </w:rPr>
       </w:r>
-      <w:hyperlink r:id="rId42">
+      <w:hyperlink r:id="rId46">
         <w:r>
           <w:rPr>
             <w:lang w:val="en_US" w:bidi="en_US"/>
@@ -1492,7 +1723,7 @@
         <w:rPr>
           <w:lang w:val="en_US" w:bidi="en_US"/>
         </w:rPr>
-        <w:t xml:space="preserve"> (269660 KB)</w:t>
+        <w:t xml:space="preserve"> (548397 KB)</w:t>
       </w:r>
       <w:r>
         <w:rPr>
@@ -1555,7 +1786,7 @@
         </w:rPr>
         <w:t xml:space="preserve"> or </w:t>
       </w:r>
-      <w:hyperlink r:id="rId43">
+      <w:hyperlink r:id="rId47">
         <w:r>
           <w:rPr>
             <w:lang w:val="en_US" w:bidi="en_US"/>
@@ -1631,7 +1862,7 @@
           <w:lang w:val="en_US" w:bidi="en_US"/>
         </w:rPr>
       </w:r>
-      <w:hyperlink r:id="rId44">
+      <w:hyperlink r:id="rId48">
         <w:r>
           <w:rPr>
             <w:lang w:val="en_US" w:bidi="en_US"/>
@@ -1697,7 +1928,7 @@
         </w:rPr>
         <w:t xml:space="preserve">The name </w:t>
       </w:r>
-      <w:hyperlink r:id="rId33">
+      <w:hyperlink r:id="rId35">
         <w:r>
           <w:rPr>
             <w:lang w:val="en_US" w:bidi="en_US"/>
@@ -1728,7 +1959,7 @@
         </w:rPr>
         <w:t xml:space="preserve">, the leader of all </w:t>
       </w:r>
-      <w:hyperlink r:id="rId32">
+      <w:hyperlink r:id="rId34">
         <w:r>
           <w:rPr>
             <w:lang w:val="en_US" w:bidi="en_US"/>
@@ -1760,7 +1991,7 @@
         </w:rPr>
         <w:t xml:space="preserve">God has created everything that exists, and therefore God also created all the spirits. God created them good, as </w:t>
       </w:r>
-      <w:hyperlink r:id="rId35">
+      <w:hyperlink r:id="rId37">
         <w:r>
           <w:rPr>
             <w:lang w:val="en_US" w:bidi="en_US"/>
@@ -1846,7 +2077,7 @@
         </w:rPr>
         <w:t xml:space="preserve">However, God is much stronger than Satan. When Jesus died and was </w:t>
       </w:r>
-      <w:hyperlink r:id="rId45">
+      <w:hyperlink r:id="rId49">
         <w:r>
           <w:rPr>
             <w:lang w:val="en_US" w:bidi="en_US"/>
@@ -1922,7 +2153,7 @@
           <w:lang w:val="en_US" w:bidi="en_US"/>
         </w:rPr>
       </w:r>
-      <w:hyperlink r:id="rId46">
+      <w:hyperlink r:id="rId50">
         <w:r>
           <w:rPr>
             <w:lang w:val="en_US" w:bidi="en_US"/>
@@ -2015,7 +2246,7 @@
         </w:rPr>
         <w:t xml:space="preserve">In the New Testament, all people who follow Jesus and want to learn from him are disciples. Sometimes Jesus sent groups of disciples out to preach the </w:t>
       </w:r>
-      <w:hyperlink r:id="rId47">
+      <w:hyperlink r:id="rId51">
         <w:r>
           <w:rPr>
             <w:lang w:val="en_US" w:bidi="en_US"/>
@@ -2033,7 +2264,7 @@
         </w:rPr>
         <w:t xml:space="preserve"> that the </w:t>
       </w:r>
-      <w:hyperlink r:id="rId48">
+      <w:hyperlink r:id="rId52">
         <w:r>
           <w:rPr>
             <w:lang w:val="en_US" w:bidi="en_US"/>
@@ -2051,7 +2282,7 @@
         </w:rPr>
         <w:t xml:space="preserve"> had come and to </w:t>
       </w:r>
-      <w:hyperlink r:id="rId49">
+      <w:hyperlink r:id="rId53">
         <w:r>
           <w:rPr>
             <w:lang w:val="en_US" w:bidi="en_US"/>
@@ -2083,7 +2314,7 @@
         </w:rPr>
         <w:t xml:space="preserve">Jesus also chose 12 people to be his special disciples. This small group is often called "the 12 disciples," or even just "the 12." These people followed Jesus everywhere, learning from him and watching him. These 12 disciples were also called </w:t>
       </w:r>
-      <w:hyperlink r:id="rId50">
+      <w:hyperlink r:id="rId54">
         <w:r>
           <w:rPr>
             <w:lang w:val="en_US" w:bidi="en_US"/>
@@ -2101,7 +2332,7 @@
         </w:rPr>
         <w:t xml:space="preserve">. An apostle is someone who has received a special </w:t>
       </w:r>
-      <w:hyperlink r:id="rId51">
+      <w:hyperlink r:id="rId55">
         <w:r>
           <w:rPr>
             <w:lang w:val="en_US" w:bidi="en_US"/>
@@ -2133,7 +2364,7 @@
         </w:rPr>
         <w:t xml:space="preserve">Before Jesus went back to </w:t>
       </w:r>
-      <w:hyperlink r:id="rId52">
+      <w:hyperlink r:id="rId56">
         <w:r>
           <w:rPr>
             <w:lang w:val="en_US" w:bidi="en_US"/>
@@ -2151,7 +2382,7 @@
         </w:rPr>
         <w:t xml:space="preserve">, he told his disciples to "go out and make all people from all </w:t>
       </w:r>
-      <w:hyperlink r:id="rId26">
+      <w:hyperlink r:id="rId29">
         <w:r>
           <w:rPr>
             <w:lang w:val="en_US" w:bidi="en_US"/>
@@ -2226,7 +2457,7 @@
         </w:rPr>
         <w:t xml:space="preserve">Remember that you need to have a different word for </w:t>
       </w:r>
-      <w:hyperlink r:id="rId50">
+      <w:hyperlink r:id="rId54">
         <w:r>
           <w:rPr>
             <w:lang w:val="en_US" w:bidi="en_US"/>
@@ -2302,7 +2533,7 @@
           <w:lang w:val="en_US" w:bidi="en_US"/>
         </w:rPr>
       </w:r>
-      <w:hyperlink r:id="rId53">
+      <w:hyperlink r:id="rId57">
         <w:r>
           <w:rPr>
             <w:lang w:val="en_US" w:bidi="en_US"/>
@@ -2475,7 +2706,7 @@
           <w:lang w:val="en_US" w:bidi="en_US"/>
         </w:rPr>
       </w:r>
-      <w:hyperlink r:id="rId54">
+      <w:hyperlink r:id="rId58">
         <w:r>
           <w:rPr>
             <w:lang w:val="en_US" w:bidi="en_US"/>
@@ -2548,7 +2779,7 @@
         </w:rPr>
         <w:t xml:space="preserve"> is a permanent and legal separation between a husband and wife. In the Old Testament, the </w:t>
       </w:r>
-      <w:hyperlink r:id="rId55">
+      <w:hyperlink r:id="rId59">
         <w:r>
           <w:rPr>
             <w:lang w:val="en_US" w:bidi="en_US"/>
@@ -2638,7 +2869,7 @@
           <w:lang w:val="en_US" w:bidi="en_US"/>
         </w:rPr>
       </w:r>
-      <w:hyperlink r:id="rId56">
+      <w:hyperlink r:id="rId60">
         <w:r>
           <w:rPr>
             <w:lang w:val="en_US" w:bidi="en_US"/>
@@ -2775,7 +3006,7 @@
           <w:lang w:val="en_US" w:bidi="en_US"/>
         </w:rPr>
       </w:r>
-      <w:hyperlink r:id="rId57">
+      <w:hyperlink r:id="rId61">
         <w:r>
           <w:rPr>
             <w:lang w:val="en_US" w:bidi="en_US"/>
@@ -2854,7 +3085,7 @@
         </w:rPr>
         <w:t xml:space="preserve"> is a type of bird that is very common in </w:t>
       </w:r>
-      <w:hyperlink r:id="rId14">
+      <w:hyperlink r:id="rId17">
         <w:r>
           <w:rPr>
             <w:lang w:val="en_US" w:bidi="en_US"/>
@@ -2886,7 +3117,7 @@
         </w:rPr>
         <w:t xml:space="preserve">God required the </w:t>
       </w:r>
-      <w:hyperlink r:id="rId18">
+      <w:hyperlink r:id="rId21">
         <w:r>
           <w:rPr>
             <w:lang w:val="en_US" w:bidi="en_US"/>
@@ -2904,7 +3135,7 @@
         </w:rPr>
         <w:t xml:space="preserve"> to offer animal </w:t>
       </w:r>
-      <w:hyperlink r:id="rId58">
+      <w:hyperlink r:id="rId62">
         <w:r>
           <w:rPr>
             <w:lang w:val="en_US" w:bidi="en_US"/>
@@ -2936,7 +3167,7 @@
         </w:rPr>
         <w:t xml:space="preserve">When Jesus was </w:t>
       </w:r>
-      <w:hyperlink r:id="rId59">
+      <w:hyperlink r:id="rId63">
         <w:r>
           <w:rPr>
             <w:lang w:val="en_US" w:bidi="en_US"/>
@@ -2954,7 +3185,7 @@
         </w:rPr>
         <w:t xml:space="preserve">, the </w:t>
       </w:r>
-      <w:hyperlink r:id="rId60">
+      <w:hyperlink r:id="rId64">
         <w:r>
           <w:rPr>
             <w:lang w:val="en_US" w:bidi="en_US"/>
@@ -3030,7 +3261,7 @@
           <w:lang w:val="en_US" w:bidi="en_US"/>
         </w:rPr>
       </w:r>
-      <w:hyperlink r:id="rId61">
+      <w:hyperlink r:id="rId65">
         <w:r>
           <w:rPr>
             <w:lang w:val="en_US" w:bidi="en_US"/>
@@ -3109,7 +3340,7 @@
         </w:rPr>
         <w:t xml:space="preserve"> is a silver Greek coin worth about a day's wages. People in Jesus' time usually used the silver Roman coin that they called a </w:t>
       </w:r>
-      <w:hyperlink r:id="rId62">
+      <w:hyperlink r:id="rId66">
         <w:r>
           <w:rPr>
             <w:lang w:val="en_US" w:bidi="en_US"/>
@@ -3185,7 +3416,7 @@
           <w:lang w:val="en_US" w:bidi="en_US"/>
         </w:rPr>
       </w:r>
-      <w:hyperlink r:id="rId63">
+      <w:hyperlink r:id="rId67">
         <w:r>
           <w:rPr>
             <w:lang w:val="en_US" w:bidi="en_US"/>
@@ -3264,7 +3495,7 @@
         </w:rPr>
         <w:t xml:space="preserve">. </w:t>
       </w:r>
-      <w:hyperlink r:id="rId64">
+      <w:hyperlink r:id="rId68">
         <w:r>
           <w:rPr>
             <w:lang w:val="en_US" w:bidi="en_US"/>
@@ -3296,7 +3527,7 @@
         </w:rPr>
         <w:t xml:space="preserve">A dream is different from a </w:t>
       </w:r>
-      <w:hyperlink r:id="rId65">
+      <w:hyperlink r:id="rId69">
         <w:r>
           <w:rPr>
             <w:lang w:val="en_US" w:bidi="en_US"/>
@@ -3372,7 +3603,7 @@
           <w:lang w:val="en_US" w:bidi="en_US"/>
         </w:rPr>
       </w:r>
-      <w:hyperlink r:id="rId66">
+      <w:hyperlink r:id="rId70">
         <w:r>
           <w:rPr>
             <w:lang w:val="en_US" w:bidi="en_US"/>

</xml_diff>